<commit_message>
codigo ATEDA historias de usuario 1-3
</commit_message>
<xml_diff>
--- a/Fase_2/Evidencias Proyecto/Documento 02- Product Backlog.docx
+++ b/Fase_2/Evidencias Proyecto/Documento 02- Product Backlog.docx
@@ -3395,6 +3395,18 @@
     </w:p>
     <w:p>
       <w:pPr>
+        <w:pStyle w:val="Prrafodelista"/>
+        <w:rPr>
+          <w:rFonts w:ascii="Arial" w:hAnsi="Arial" w:cs="Arial"/>
+          <w:b/>
+          <w:bCs/>
+          <w:color w:val="1F497D" w:themeColor="text2"/>
+          <w:lang w:val="es-ES" w:eastAsia="es-ES"/>
+        </w:rPr>
+      </w:pPr>
+    </w:p>
+    <w:p>
+      <w:pPr>
         <w:pStyle w:val="Ttulo2"/>
         <w:rPr>
           <w:rFonts w:ascii="Arial" w:hAnsi="Arial" w:cs="Arial"/>
@@ -3666,6 +3678,18 @@
     </w:p>
     <w:p>
       <w:pPr>
+        <w:pStyle w:val="Prrafodelista"/>
+        <w:rPr>
+          <w:rFonts w:ascii="Arial" w:hAnsi="Arial" w:cs="Arial"/>
+          <w:b/>
+          <w:bCs/>
+          <w:color w:val="1F497D" w:themeColor="text2"/>
+          <w:lang w:val="es-ES" w:eastAsia="es-ES"/>
+        </w:rPr>
+      </w:pPr>
+    </w:p>
+    <w:p>
+      <w:pPr>
         <w:pStyle w:val="Ttulo2"/>
         <w:rPr>
           <w:rFonts w:ascii="Arial" w:hAnsi="Arial" w:cs="Arial"/>
@@ -3884,39 +3908,35 @@
       <w:pPr>
         <w:rPr>
           <w:rFonts w:ascii="Arial" w:hAnsi="Arial" w:cs="Arial"/>
-          <w:color w:val="1F497D" w:themeColor="text2"/>
-        </w:rPr>
-      </w:pPr>
-      <w:r>
-        <w:rPr>
-          <w:rFonts w:ascii="Arial" w:hAnsi="Arial" w:cs="Arial"/>
-          <w:color w:val="1F497D" w:themeColor="text2"/>
+          <w:b/>
+          <w:bCs/>
+          <w:color w:val="1F497D" w:themeColor="text2"/>
+          <w:sz w:val="26"/>
+          <w:szCs w:val="26"/>
+        </w:rPr>
+      </w:pPr>
+      <w:r>
+        <w:rPr>
+          <w:rFonts w:ascii="Arial" w:hAnsi="Arial" w:cs="Arial"/>
+          <w:b/>
+          <w:bCs/>
+          <w:color w:val="1F497D" w:themeColor="text2"/>
+          <w:sz w:val="26"/>
+          <w:szCs w:val="26"/>
         </w:rPr>
         <w:br w:type="page"/>
       </w:r>
-    </w:p>
-    <w:p>
-      <w:pPr>
-        <w:pStyle w:val="Ttulo2"/>
-        <w:rPr>
-          <w:rFonts w:ascii="Arial" w:hAnsi="Arial" w:cs="Arial"/>
-          <w:color w:val="1F497D" w:themeColor="text2"/>
-        </w:rPr>
-      </w:pPr>
-      <w:r>
-        <w:rPr>
-          <w:rFonts w:ascii="Arial" w:hAnsi="Arial" w:cs="Arial"/>
-          <w:color w:val="1F497D" w:themeColor="text2"/>
+      <w:r>
+        <w:rPr>
+          <w:rFonts w:ascii="Arial" w:hAnsi="Arial" w:cs="Arial"/>
+          <w:b/>
+          <w:bCs/>
+          <w:color w:val="1F497D" w:themeColor="text2"/>
+          <w:sz w:val="26"/>
+          <w:szCs w:val="26"/>
         </w:rPr>
         <w:lastRenderedPageBreak/>
-        <w:t>Historia 00</w:t>
-      </w:r>
-      <w:r>
-        <w:rPr>
-          <w:rFonts w:ascii="Arial" w:hAnsi="Arial" w:cs="Arial"/>
-          <w:color w:val="1F497D" w:themeColor="text2"/>
-        </w:rPr>
-        <w:t>4 – Consultar estudiantes</w:t>
+        <w:t>Historia 004 – Consultar estudiantes</w:t>
       </w:r>
     </w:p>
     <w:p>
@@ -4134,10 +4154,11 @@
     </w:p>
     <w:p>
       <w:pPr>
-        <w:rPr>
-          <w:rFonts w:ascii="Arial" w:hAnsi="Arial" w:cs="Arial"/>
-          <w:color w:val="1F497D" w:themeColor="text2"/>
-          <w:lang w:val="es-ES"/>
+        <w:pStyle w:val="Prrafodelista"/>
+        <w:rPr>
+          <w:rFonts w:ascii="Arial" w:hAnsi="Arial" w:cs="Arial"/>
+          <w:color w:val="1F497D" w:themeColor="text2"/>
+          <w:lang w:val="es-ES" w:eastAsia="es-ES"/>
         </w:rPr>
       </w:pPr>
     </w:p>
@@ -4697,7 +4718,6 @@
           <w:color w:val="1F497D" w:themeColor="text2"/>
           <w:lang w:val="es-ES" w:eastAsia="es-ES"/>
         </w:rPr>
-        <w:lastRenderedPageBreak/>
         <w:t xml:space="preserve">Criterio 6: </w:t>
       </w:r>
       <w:r>
@@ -5289,7 +5309,6 @@
           <w:rFonts w:ascii="Arial" w:hAnsi="Arial"/>
           <w:color w:val="1F497D" w:themeColor="text2"/>
         </w:rPr>
-        <w:lastRenderedPageBreak/>
         <w:t>Criterios de Aceptación</w:t>
       </w:r>
     </w:p>
@@ -5358,6 +5377,7 @@
           <w:color w:val="1F497D" w:themeColor="text2"/>
           <w:lang w:val="es-ES" w:eastAsia="es-ES"/>
         </w:rPr>
+        <w:lastRenderedPageBreak/>
         <w:t xml:space="preserve">Criterio 2: </w:t>
       </w:r>
       <w:r>
@@ -14392,6 +14412,7 @@
     <w:rsid w:val="00252686"/>
     <w:rsid w:val="002835FC"/>
     <w:rsid w:val="002C06A7"/>
+    <w:rsid w:val="00320554"/>
     <w:rsid w:val="00387FD7"/>
     <w:rsid w:val="004F7F49"/>
     <w:rsid w:val="0057410B"/>
@@ -14416,10 +14437,13 @@
     <w:rsid w:val="00C47BA2"/>
     <w:rsid w:val="00C5036F"/>
     <w:rsid w:val="00C861E5"/>
+    <w:rsid w:val="00CD5CD6"/>
     <w:rsid w:val="00CF44FB"/>
+    <w:rsid w:val="00D14A17"/>
     <w:rsid w:val="00DD693D"/>
     <w:rsid w:val="00EC21D5"/>
     <w:rsid w:val="00F973B6"/>
+    <w:rsid w:val="00FA717A"/>
   </w:rsids>
   <m:mathPr>
     <m:mathFont m:val="Cambria Math"/>
@@ -15172,10 +15196,6 @@
 </file>
 
 <file path=customXml/item2.xml><?xml version="1.0" encoding="utf-8"?>
-<b:Sources xmlns:b="http://schemas.openxmlformats.org/officeDocument/2006/bibliography" xmlns="http://schemas.openxmlformats.org/officeDocument/2006/bibliography" SelectedStyle="\APA.XSL" StyleName="APA"/>
-</file>
-
-<file path=customXml/item3.xml><?xml version="1.0" encoding="utf-8"?>
 <p:properties xmlns:p="http://schemas.microsoft.com/office/2006/metadata/properties" xmlns:xsi="http://www.w3.org/2001/XMLSchema-instance" xmlns:pc="http://schemas.microsoft.com/office/infopath/2007/PartnerControls">
   <documentManagement>
     <lcf76f155ced4ddcb4097134ff3c332f xmlns="e1e7bc46-bed0-459f-9452-a76b1c5b695e">
@@ -15185,7 +15205,7 @@
 </p:properties>
 </file>
 
-<file path=customXml/item4.xml><?xml version="1.0" encoding="utf-8"?>
+<file path=customXml/item3.xml><?xml version="1.0" encoding="utf-8"?>
 <ct:contentTypeSchema xmlns:ct="http://schemas.microsoft.com/office/2006/metadata/contentType" xmlns:ma="http://schemas.microsoft.com/office/2006/metadata/properties/metaAttributes" ct:_="" ma:_="" ma:contentTypeName="Documento" ma:contentTypeID="0x0101005395107FFD641345A10C8A5ACACB9D20" ma:contentTypeVersion="13" ma:contentTypeDescription="Crear nuevo documento." ma:contentTypeScope="" ma:versionID="7407f70e7181b908656026f379795b2c">
   <xsd:schema xmlns:xsd="http://www.w3.org/2001/XMLSchema" xmlns:xs="http://www.w3.org/2001/XMLSchema" xmlns:p="http://schemas.microsoft.com/office/2006/metadata/properties" xmlns:ns2="e1e7bc46-bed0-459f-9452-a76b1c5b695e" xmlns:ns3="bb8cf7e1-610f-40a0-8f00-126b9d139fde" targetNamespace="http://schemas.microsoft.com/office/2006/metadata/properties" ma:root="true" ma:fieldsID="b29ea8901729e1eaaa4e48e09148c760" ns2:_="" ns3:_="">
     <xsd:import namespace="e1e7bc46-bed0-459f-9452-a76b1c5b695e"/>
@@ -15402,13 +15422,17 @@
 </ct:contentTypeSchema>
 </file>
 
-<file path=customXml/item5.xml><?xml version="1.0" encoding="utf-8"?>
+<file path=customXml/item4.xml><?xml version="1.0" encoding="utf-8"?>
 <?mso-contentType ?>
 <FormTemplates xmlns="http://schemas.microsoft.com/sharepoint/v3/contenttype/forms">
   <Display>DocumentLibraryForm</Display>
   <Edit>DocumentLibraryForm</Edit>
   <New>DocumentLibraryForm</New>
 </FormTemplates>
+</file>
+
+<file path=customXml/item5.xml><?xml version="1.0" encoding="utf-8"?>
+<b:Sources xmlns:b="http://schemas.openxmlformats.org/officeDocument/2006/bibliography" xmlns="http://schemas.openxmlformats.org/officeDocument/2006/bibliography" SelectedStyle="\APA.XSL" StyleName="APA"/>
 </file>
 
 <file path=customXml/itemProps1.xml><?xml version="1.0" encoding="utf-8"?>
@@ -15420,14 +15444,6 @@
 </file>
 
 <file path=customXml/itemProps2.xml><?xml version="1.0" encoding="utf-8"?>
-<ds:datastoreItem xmlns:ds="http://schemas.openxmlformats.org/officeDocument/2006/customXml" ds:itemID="{BD6EC776-6679-4C69-98E3-6D068EA0A3C9}">
-  <ds:schemaRefs>
-    <ds:schemaRef ds:uri="http://schemas.openxmlformats.org/officeDocument/2006/bibliography"/>
-  </ds:schemaRefs>
-</ds:datastoreItem>
-</file>
-
-<file path=customXml/itemProps3.xml><?xml version="1.0" encoding="utf-8"?>
 <ds:datastoreItem xmlns:ds="http://schemas.openxmlformats.org/officeDocument/2006/customXml" ds:itemID="{E1036DFC-1D85-404D-898C-621D06C0EB1C}">
   <ds:schemaRefs>
     <ds:schemaRef ds:uri="http://schemas.microsoft.com/office/2006/metadata/properties"/>
@@ -15437,7 +15453,7 @@
 </ds:datastoreItem>
 </file>
 
-<file path=customXml/itemProps4.xml><?xml version="1.0" encoding="utf-8"?>
+<file path=customXml/itemProps3.xml><?xml version="1.0" encoding="utf-8"?>
 <ds:datastoreItem xmlns:ds="http://schemas.openxmlformats.org/officeDocument/2006/customXml" ds:itemID="{444115BD-C1C6-48AD-B714-E1866627071D}">
   <ds:schemaRefs>
     <ds:schemaRef ds:uri="http://schemas.microsoft.com/office/2006/metadata/contentType"/>
@@ -15456,10 +15472,18 @@
 </ds:datastoreItem>
 </file>
 
-<file path=customXml/itemProps5.xml><?xml version="1.0" encoding="utf-8"?>
+<file path=customXml/itemProps4.xml><?xml version="1.0" encoding="utf-8"?>
 <ds:datastoreItem xmlns:ds="http://schemas.openxmlformats.org/officeDocument/2006/customXml" ds:itemID="{EE9AAF0E-D63F-459F-A0FB-CDCE9F728F33}">
   <ds:schemaRefs>
     <ds:schemaRef ds:uri="http://schemas.microsoft.com/sharepoint/v3/contenttype/forms"/>
   </ds:schemaRefs>
 </ds:datastoreItem>
+</file>
+
+<file path=customXml/itemProps5.xml><?xml version="1.0" encoding="utf-8"?>
+<ds:datastoreItem xmlns:ds="http://schemas.openxmlformats.org/officeDocument/2006/customXml" ds:itemID="{BD6EC776-6679-4C69-98E3-6D068EA0A3C9}">
+  <ds:schemaRefs>
+    <ds:schemaRef ds:uri="http://schemas.openxmlformats.org/officeDocument/2006/bibliography"/>
+  </ds:schemaRefs>
+</ds:datastoreItem>
 </file>
</xml_diff>